<commit_message>
Update experience and skills
</commit_message>
<xml_diff>
--- a/v2/Gowtham_Resume.docx
+++ b/v2/Gowtham_Resume.docx
@@ -1232,6 +1232,13 @@
         </w:rPr>
         <w:t xml:space="preserve"> Pipelines</w:t>
       </w:r>
+      <w:r>
+        <w:rPr>
+          <w:rFonts w:ascii="Arial" w:hAnsi="Arial" w:cs="Arial"/>
+          <w:color w:val="24292E"/>
+        </w:rPr>
+        <w:t>, Azure</w:t>
+      </w:r>
     </w:p>
     <w:p>
       <w:pPr>
@@ -1303,6 +1310,13 @@
         </w:rPr>
         <w:t>MySQL</w:t>
       </w:r>
+      <w:r>
+        <w:rPr>
+          <w:rFonts w:ascii="Arial" w:hAnsi="Arial" w:cs="Arial"/>
+          <w:color w:val="24292E"/>
+        </w:rPr>
+        <w:t>, SQL Server</w:t>
+      </w:r>
     </w:p>
     <w:p>
       <w:pPr>
@@ -1392,6 +1406,13 @@
           <w:color w:val="24292E"/>
         </w:rPr>
         <w:t>gdb</w:t>
+      </w:r>
+      <w:r>
+        <w:rPr>
+          <w:rFonts w:ascii="Arial" w:hAnsi="Arial" w:cs="Arial"/>
+          <w:color w:val="24292E"/>
+        </w:rPr>
+        <w:t>, Postman</w:t>
       </w:r>
     </w:p>
     <w:p>
@@ -1560,7 +1581,7 @@
           <w:bCs/>
           <w:color w:val="24292E"/>
         </w:rPr>
-        <w:t>EOG</w:t>
+        <w:t>Shell</w:t>
       </w:r>
       <w:r>
         <w:rPr>
@@ -1579,7 +1600,7 @@
           <w:bCs/>
           <w:color w:val="24292E"/>
         </w:rPr>
-        <w:t>Resources</w:t>
+        <w:t>India Markets</w:t>
       </w:r>
       <w:r>
         <w:rPr>
@@ -1624,7 +1645,7 @@
           <w:bCs/>
           <w:color w:val="24292E"/>
         </w:rPr>
-        <w:t>FirstLight</w:t>
+        <w:t>Randstad</w:t>
       </w:r>
       <w:r>
         <w:rPr>
@@ -1643,7 +1664,16 @@
           <w:bCs/>
           <w:color w:val="24292E"/>
         </w:rPr>
-        <w:t>Consulting)</w:t>
+        <w:t>Digital</w:t>
+      </w:r>
+      <w:r>
+        <w:rPr>
+          <w:rFonts w:ascii="Arial" w:hAnsi="Arial" w:cs="Arial"/>
+          <w:b/>
+          <w:bCs/>
+          <w:color w:val="24292E"/>
+        </w:rPr>
+        <w:t>)</w:t>
       </w:r>
       <w:r>
         <w:rPr>
@@ -1681,7 +1711,16 @@
           <w:bCs/>
           <w:color w:val="24292E"/>
         </w:rPr>
-        <w:t>Software</w:t>
+        <w:t>S</w:t>
+      </w:r>
+      <w:r>
+        <w:rPr>
+          <w:rFonts w:ascii="Arial" w:hAnsi="Arial" w:cs="Arial"/>
+          <w:b/>
+          <w:bCs/>
+          <w:color w:val="24292E"/>
+        </w:rPr>
+        <w:t>enior Technical</w:t>
       </w:r>
       <w:r>
         <w:rPr>
@@ -1738,7 +1777,7 @@
           <w:bCs/>
           <w:color w:val="24292E"/>
         </w:rPr>
-        <w:t>Nov</w:t>
+        <w:t>Jan</w:t>
       </w:r>
       <w:r>
         <w:rPr>
@@ -1757,7 +1796,16 @@
           <w:bCs/>
           <w:color w:val="24292E"/>
         </w:rPr>
-        <w:t>2023</w:t>
+        <w:t>202</w:t>
+      </w:r>
+      <w:r>
+        <w:rPr>
+          <w:rFonts w:ascii="Arial" w:hAnsi="Arial" w:cs="Arial"/>
+          <w:b/>
+          <w:bCs/>
+          <w:color w:val="24292E"/>
+        </w:rPr>
+        <w:t>6</w:t>
       </w:r>
       <w:r>
         <w:rPr>
@@ -1796,7 +1844,7 @@
           <w:color w:val="24292E"/>
           <w:spacing w:val="-2"/>
         </w:rPr>
-        <w:t>Apr 2025</w:t>
+        <w:t>Present</w:t>
       </w:r>
     </w:p>
     <w:p>
@@ -1813,6 +1861,396 @@
         <w:ind w:right="495"/>
         <w:rPr>
           <w:rFonts w:ascii="Arial" w:hAnsi="Arial" w:cs="Arial"/>
+          <w:color w:val="24292E"/>
+        </w:rPr>
+      </w:pPr>
+      <w:r>
+        <w:rPr>
+          <w:rFonts w:ascii="Arial" w:hAnsi="Arial" w:cs="Arial"/>
+          <w:color w:val="24292E"/>
+        </w:rPr>
+        <w:t xml:space="preserve">Designed and implemented </w:t>
+      </w:r>
+      <w:r>
+        <w:rPr>
+          <w:rFonts w:ascii="Arial" w:hAnsi="Arial" w:cs="Arial"/>
+          <w:b/>
+          <w:bCs/>
+          <w:color w:val="24292E"/>
+        </w:rPr>
+        <w:t>REST API</w:t>
+      </w:r>
+      <w:r>
+        <w:rPr>
+          <w:rFonts w:ascii="Arial" w:hAnsi="Arial" w:cs="Arial"/>
+          <w:color w:val="24292E"/>
+        </w:rPr>
+        <w:t xml:space="preserve"> (</w:t>
+      </w:r>
+      <w:r>
+        <w:rPr>
+          <w:rFonts w:ascii="Arial" w:hAnsi="Arial" w:cs="Arial"/>
+          <w:b/>
+          <w:bCs/>
+          <w:color w:val="24292E"/>
+        </w:rPr>
+        <w:t>Python</w:t>
+      </w:r>
+      <w:r>
+        <w:rPr>
+          <w:rFonts w:ascii="Arial" w:hAnsi="Arial" w:cs="Arial"/>
+          <w:color w:val="24292E"/>
+        </w:rPr>
+        <w:t xml:space="preserve">, </w:t>
+      </w:r>
+      <w:r>
+        <w:rPr>
+          <w:rFonts w:ascii="Arial" w:hAnsi="Arial" w:cs="Arial"/>
+          <w:b/>
+          <w:bCs/>
+          <w:color w:val="24292E"/>
+        </w:rPr>
+        <w:t>FastAPI</w:t>
+      </w:r>
+      <w:r>
+        <w:rPr>
+          <w:rFonts w:ascii="Arial" w:hAnsi="Arial" w:cs="Arial"/>
+          <w:color w:val="24292E"/>
+        </w:rPr>
+        <w:t xml:space="preserve">), and increased </w:t>
+      </w:r>
+      <w:r>
+        <w:rPr>
+          <w:rFonts w:ascii="Arial" w:hAnsi="Arial" w:cs="Arial"/>
+          <w:color w:val="24292E"/>
+        </w:rPr>
+        <w:t xml:space="preserve">application </w:t>
+      </w:r>
+      <w:r>
+        <w:rPr>
+          <w:rFonts w:ascii="Arial" w:hAnsi="Arial" w:cs="Arial"/>
+          <w:color w:val="24292E"/>
+        </w:rPr>
+        <w:t>performance and code</w:t>
+      </w:r>
+      <w:r>
+        <w:rPr>
+          <w:rFonts w:ascii="Arial" w:hAnsi="Arial" w:cs="Arial"/>
+          <w:color w:val="24292E"/>
+        </w:rPr>
+        <w:t xml:space="preserve"> </w:t>
+      </w:r>
+      <w:r>
+        <w:rPr>
+          <w:rFonts w:ascii="Arial" w:hAnsi="Arial" w:cs="Arial"/>
+          <w:color w:val="24292E"/>
+        </w:rPr>
+        <w:t xml:space="preserve">reusability by </w:t>
+      </w:r>
+      <w:r>
+        <w:rPr>
+          <w:rFonts w:ascii="Arial" w:hAnsi="Arial" w:cs="Arial"/>
+          <w:b/>
+          <w:bCs/>
+          <w:color w:val="24292E"/>
+        </w:rPr>
+        <w:t>50%</w:t>
+      </w:r>
+      <w:r>
+        <w:rPr>
+          <w:rFonts w:ascii="Arial" w:hAnsi="Arial" w:cs="Arial"/>
+          <w:color w:val="24292E"/>
+        </w:rPr>
+        <w:t xml:space="preserve"> using </w:t>
+      </w:r>
+      <w:r>
+        <w:rPr>
+          <w:rFonts w:ascii="Arial" w:hAnsi="Arial" w:cs="Arial"/>
+          <w:b/>
+          <w:bCs/>
+          <w:color w:val="24292E"/>
+        </w:rPr>
+        <w:t>SOLID</w:t>
+      </w:r>
+      <w:r>
+        <w:rPr>
+          <w:rFonts w:ascii="Arial" w:hAnsi="Arial" w:cs="Arial"/>
+          <w:color w:val="24292E"/>
+        </w:rPr>
+        <w:t xml:space="preserve"> principles and design patterns.</w:t>
+      </w:r>
+    </w:p>
+    <w:p>
+      <w:pPr>
+        <w:pStyle w:val="BodyText"/>
+        <w:spacing w:before="313"/>
+        <w:ind w:left="225"/>
+        <w:rPr>
+          <w:rFonts w:ascii="Arial" w:hAnsi="Arial" w:cs="Arial"/>
+          <w:b/>
+          <w:bCs/>
+        </w:rPr>
+      </w:pPr>
+      <w:r>
+        <w:rPr>
+          <w:rFonts w:ascii="Arial" w:hAnsi="Arial" w:cs="Arial"/>
+          <w:b/>
+          <w:bCs/>
+          <w:color w:val="24292E"/>
+        </w:rPr>
+        <w:t>EOG</w:t>
+      </w:r>
+      <w:r>
+        <w:rPr>
+          <w:rFonts w:ascii="Arial" w:hAnsi="Arial" w:cs="Arial"/>
+          <w:b/>
+          <w:bCs/>
+          <w:color w:val="24292E"/>
+          <w:spacing w:val="11"/>
+        </w:rPr>
+        <w:t xml:space="preserve"> </w:t>
+      </w:r>
+      <w:r>
+        <w:rPr>
+          <w:rFonts w:ascii="Arial" w:hAnsi="Arial" w:cs="Arial"/>
+          <w:b/>
+          <w:bCs/>
+          <w:color w:val="24292E"/>
+        </w:rPr>
+        <w:t>Resources</w:t>
+      </w:r>
+      <w:r>
+        <w:rPr>
+          <w:rFonts w:ascii="Arial" w:hAnsi="Arial" w:cs="Arial"/>
+          <w:b/>
+          <w:bCs/>
+          <w:color w:val="24292E"/>
+          <w:spacing w:val="12"/>
+        </w:rPr>
+        <w:t xml:space="preserve"> </w:t>
+      </w:r>
+      <w:r>
+        <w:rPr>
+          <w:rFonts w:ascii="Arial" w:hAnsi="Arial" w:cs="Arial"/>
+          <w:b/>
+          <w:bCs/>
+          <w:color w:val="24292E"/>
+        </w:rPr>
+        <w:t>(</w:t>
+      </w:r>
+      <w:r>
+        <w:rPr>
+          <w:rFonts w:ascii="Arial" w:hAnsi="Arial" w:cs="Arial"/>
+          <w:color w:val="24292E"/>
+        </w:rPr>
+        <w:t>via</w:t>
+      </w:r>
+      <w:r>
+        <w:rPr>
+          <w:rFonts w:ascii="Arial" w:hAnsi="Arial" w:cs="Arial"/>
+          <w:b/>
+          <w:bCs/>
+          <w:color w:val="24292E"/>
+          <w:spacing w:val="12"/>
+        </w:rPr>
+        <w:t xml:space="preserve"> </w:t>
+      </w:r>
+      <w:r>
+        <w:rPr>
+          <w:rFonts w:ascii="Arial" w:hAnsi="Arial" w:cs="Arial"/>
+          <w:b/>
+          <w:bCs/>
+          <w:color w:val="24292E"/>
+        </w:rPr>
+        <w:t>FirstLight</w:t>
+      </w:r>
+      <w:r>
+        <w:rPr>
+          <w:rFonts w:ascii="Arial" w:hAnsi="Arial" w:cs="Arial"/>
+          <w:b/>
+          <w:bCs/>
+          <w:color w:val="24292E"/>
+          <w:spacing w:val="12"/>
+        </w:rPr>
+        <w:t xml:space="preserve"> </w:t>
+      </w:r>
+      <w:r>
+        <w:rPr>
+          <w:rFonts w:ascii="Arial" w:hAnsi="Arial" w:cs="Arial"/>
+          <w:b/>
+          <w:bCs/>
+          <w:color w:val="24292E"/>
+        </w:rPr>
+        <w:t>Consulting)</w:t>
+      </w:r>
+      <w:r>
+        <w:rPr>
+          <w:rFonts w:ascii="Arial" w:hAnsi="Arial" w:cs="Arial"/>
+          <w:b/>
+          <w:bCs/>
+          <w:color w:val="24292E"/>
+          <w:spacing w:val="12"/>
+        </w:rPr>
+        <w:t xml:space="preserve"> </w:t>
+      </w:r>
+      <w:r>
+        <w:rPr>
+          <w:rFonts w:ascii="Arial" w:hAnsi="Arial" w:cs="Arial"/>
+          <w:b/>
+          <w:bCs/>
+          <w:color w:val="24292E"/>
+        </w:rPr>
+        <w:t>|</w:t>
+      </w:r>
+      <w:r>
+        <w:rPr>
+          <w:rFonts w:ascii="Arial" w:hAnsi="Arial" w:cs="Arial"/>
+          <w:b/>
+          <w:bCs/>
+          <w:color w:val="24292E"/>
+          <w:spacing w:val="12"/>
+        </w:rPr>
+        <w:t xml:space="preserve"> </w:t>
+      </w:r>
+      <w:r>
+        <w:rPr>
+          <w:rFonts w:ascii="Arial" w:hAnsi="Arial" w:cs="Arial"/>
+          <w:b/>
+          <w:bCs/>
+          <w:color w:val="24292E"/>
+        </w:rPr>
+        <w:t>Software</w:t>
+      </w:r>
+      <w:r>
+        <w:rPr>
+          <w:rFonts w:ascii="Arial" w:hAnsi="Arial" w:cs="Arial"/>
+          <w:b/>
+          <w:bCs/>
+          <w:color w:val="24292E"/>
+          <w:spacing w:val="12"/>
+        </w:rPr>
+        <w:t xml:space="preserve"> </w:t>
+      </w:r>
+      <w:r>
+        <w:rPr>
+          <w:rFonts w:ascii="Arial" w:hAnsi="Arial" w:cs="Arial"/>
+          <w:b/>
+          <w:bCs/>
+          <w:color w:val="24292E"/>
+        </w:rPr>
+        <w:t>Consultant</w:t>
+      </w:r>
+      <w:r>
+        <w:rPr>
+          <w:rFonts w:ascii="Arial" w:hAnsi="Arial" w:cs="Arial"/>
+          <w:b/>
+          <w:bCs/>
+          <w:color w:val="24292E"/>
+          <w:spacing w:val="11"/>
+        </w:rPr>
+        <w:t xml:space="preserve"> </w:t>
+      </w:r>
+      <w:r>
+        <w:rPr>
+          <w:rFonts w:ascii="Arial" w:hAnsi="Arial" w:cs="Arial"/>
+          <w:b/>
+          <w:bCs/>
+          <w:color w:val="24292E"/>
+        </w:rPr>
+        <w:t>|</w:t>
+      </w:r>
+      <w:r>
+        <w:rPr>
+          <w:rFonts w:ascii="Arial" w:hAnsi="Arial" w:cs="Arial"/>
+          <w:b/>
+          <w:bCs/>
+          <w:color w:val="24292E"/>
+          <w:spacing w:val="12"/>
+        </w:rPr>
+        <w:t xml:space="preserve"> </w:t>
+      </w:r>
+      <w:r>
+        <w:rPr>
+          <w:rFonts w:ascii="Arial" w:hAnsi="Arial" w:cs="Arial"/>
+          <w:b/>
+          <w:bCs/>
+          <w:color w:val="24292E"/>
+        </w:rPr>
+        <w:t>Nov</w:t>
+      </w:r>
+      <w:r>
+        <w:rPr>
+          <w:rFonts w:ascii="Arial" w:hAnsi="Arial" w:cs="Arial"/>
+          <w:b/>
+          <w:bCs/>
+          <w:color w:val="24292E"/>
+          <w:spacing w:val="12"/>
+        </w:rPr>
+        <w:t xml:space="preserve"> </w:t>
+      </w:r>
+      <w:r>
+        <w:rPr>
+          <w:rFonts w:ascii="Arial" w:hAnsi="Arial" w:cs="Arial"/>
+          <w:b/>
+          <w:bCs/>
+          <w:color w:val="24292E"/>
+        </w:rPr>
+        <w:t>2023</w:t>
+      </w:r>
+      <w:r>
+        <w:rPr>
+          <w:rFonts w:ascii="Arial" w:hAnsi="Arial" w:cs="Arial"/>
+          <w:b/>
+          <w:bCs/>
+          <w:color w:val="24292E"/>
+          <w:spacing w:val="12"/>
+        </w:rPr>
+        <w:t xml:space="preserve"> </w:t>
+      </w:r>
+      <w:r>
+        <w:rPr>
+          <w:rFonts w:ascii="Arial" w:hAnsi="Arial" w:cs="Arial"/>
+          <w:b/>
+          <w:bCs/>
+          <w:color w:val="24292E"/>
+        </w:rPr>
+        <w:t>-</w:t>
+      </w:r>
+      <w:r>
+        <w:rPr>
+          <w:rFonts w:ascii="Arial" w:hAnsi="Arial" w:cs="Arial"/>
+          <w:b/>
+          <w:bCs/>
+          <w:color w:val="24292E"/>
+          <w:spacing w:val="12"/>
+        </w:rPr>
+        <w:t xml:space="preserve"> </w:t>
+      </w:r>
+      <w:r>
+        <w:rPr>
+          <w:rFonts w:ascii="Arial" w:hAnsi="Arial" w:cs="Arial"/>
+          <w:b/>
+          <w:bCs/>
+          <w:color w:val="24292E"/>
+          <w:spacing w:val="-2"/>
+        </w:rPr>
+        <w:t>Apr 2025</w:t>
+      </w:r>
+    </w:p>
+    <w:p>
+      <w:pPr>
+        <w:pStyle w:val="ListParagraph"/>
+        <w:numPr>
+          <w:ilvl w:val="0"/>
+          <w:numId w:val="1"/>
+        </w:numPr>
+        <w:tabs>
+          <w:tab w:val="left" w:pos="676"/>
+        </w:tabs>
+        <w:spacing w:line="278" w:lineRule="auto"/>
+        <w:ind w:right="495"/>
+        <w:rPr>
+          <w:rFonts w:ascii="Arial" w:hAnsi="Arial" w:cs="Arial"/>
         </w:rPr>
       </w:pPr>
       <w:r>
@@ -3141,6 +3579,7 @@
           <w:rFonts w:ascii="Arial" w:hAnsi="Arial" w:cs="Arial"/>
           <w:color w:val="24292E"/>
         </w:rPr>
+        <w:lastRenderedPageBreak/>
         <w:t>Developed a full-stack PCAP analysis tool (</w:t>
       </w:r>
       <w:r>
@@ -3195,25 +3634,6 @@
     </w:p>
     <w:p>
       <w:pPr>
-        <w:rPr>
-          <w:rFonts w:ascii="Arial" w:hAnsi="Arial" w:cs="Arial"/>
-          <w:b/>
-          <w:bCs/>
-          <w:color w:val="24292E"/>
-        </w:rPr>
-      </w:pPr>
-      <w:r>
-        <w:rPr>
-          <w:rFonts w:ascii="Arial" w:hAnsi="Arial" w:cs="Arial"/>
-          <w:b/>
-          <w:bCs/>
-          <w:color w:val="24292E"/>
-        </w:rPr>
-        <w:br w:type="page"/>
-      </w:r>
-    </w:p>
-    <w:p>
-      <w:pPr>
         <w:pStyle w:val="BodyText"/>
         <w:spacing w:before="0"/>
         <w:ind w:left="225"/>
@@ -3230,7 +3650,6 @@
           <w:bCs/>
           <w:color w:val="24292E"/>
         </w:rPr>
-        <w:lastRenderedPageBreak/>
         <w:t>Sandvine</w:t>
       </w:r>
       <w:r>
@@ -6724,7 +7143,7 @@
         <v:path o:extrusionok="f" gradientshapeok="t" o:connecttype="rect"/>
         <o:lock v:ext="edit" aspectratio="t"/>
       </v:shapetype>
-      <v:shape id="_x0000_i1030" type="#_x0000_t75" style="width:9pt;height:9pt;visibility:visible;mso-wrap-style:square" o:bullet="t">
+      <v:shape id="_x0000_i1025" type="#_x0000_t75" style="width:9pt;height:9pt;visibility:visible;mso-wrap-style:square" o:bullet="t">
         <v:imagedata r:id="rId1" o:title=""/>
       </v:shape>
     </w:pict>

</xml_diff>